<commit_message>
Convert SWI-PRO-MET-201-002 and 201-003 to Heritage format; generalise builder
Co-Authored-By: Claude Sonnet 5.5 <noreply@anthropic.com>
Claude-Session: https://claude.ai/code/session_01UHnSDEBA56GANs2gfXuK2P
</commit_message>
<xml_diff>
--- a/SWI/201-Plant-Sampling/MM-4034-033-OR-03-SWI-PRO-MET-201-001-Front-End-Sampling-Round---Scrubber-Discharge-Hopper-and-Trash-Scr-RevA.docx
+++ b/SWI/201-Plant-Sampling/MM-4034-033-OR-03-SWI-PRO-MET-201-001-Front-End-Sampling-Round---Scrubber-Discharge-Hopper-and-Trash-Scr-RevA.docx
@@ -983,25 +983,6 @@
         </w:tc>
       </w:tr>
     </w:tbl>
-    <w:p>
-      <w:pPr>
-        <w:pStyle w:val="Heading1"/>
-        <w:tabs>
-          <w:tab w:val="num" w:pos="851"/>
-          <w:tab w:val="right" w:leader="dot" w:pos="9639"/>
-        </w:tabs>
-        <w:spacing w:before="0" w:after="0"/>
-        <w:ind w:left="851" w:hanging="851"/>
-        <w:rPr>
-          <w:rFonts w:cstheme="minorHAnsi"/>
-          <w:b/>
-          <w:color w:val="996633"/>
-          <w:sz w:val="24"/>
-          <w:szCs w:val="24"/>
-          <w:lang w:eastAsia="en-AU"/>
-        </w:rPr>
-      </w:pPr>
-    </w:p>
     <w:p>
       <w:pPr>
         <w:pStyle w:val="Heading1"/>

</xml_diff>